<commit_message>
Sandy & Junior 2027: revisão da Parte 2
Co-Authored-By: Claude Opus 5.5 <noreply@anthropic.com>
Claude-Session: https://claude.ai/code/session_01MJjUEEZrxQDEUifKK2vj9g
</commit_message>
<xml_diff>
--- a/roteiros/sandy-junior-2027/SJ27_Parte2.docx
+++ b/roteiros/sandy-junior-2027/SJ27_Parte2.docx
@@ -95,7 +95,7 @@
         <w:rPr>
           <w:color w:val="C00000"/>
         </w:rPr>
-        <w:t>Imagine que fosse com o seu filho. Uma criança levada até um estúdio de televisão, pronta para cantar, e mandada embora pela porta antes de abrir a boca. Aconteceu com Sandy e Junior. E o pai dos dois guardou essa mágoa por muitos anos.</w:t>
+        <w:t>Imagine que fosse com o seu filho. Uma criança levada até um estúdio de televisão, pronta para cantar, e mandada embora pela porta antes de abrir a boca. Aconteceu com Sandy e Junior. E o pai dos dois ficou profundamente magoado.</w:t>
       </w:r>
     </w:p>
     <w:p>
@@ -159,7 +159,7 @@
         <w:rPr>
           <w:color w:val="000000"/>
         </w:rPr>
-        <w:t>Xororó ficou profundamente magoado. Para ele, dois filhos pequenos tinham pagado por uma briga que era só entre adultos.</w:t>
+        <w:t>Xororó sentiu o golpe. Para ele, dois filhos pequenos tinham pagado por uma briga que era só entre adultos.</w:t>
       </w:r>
     </w:p>
     <w:p>
@@ -279,7 +279,7 @@
         <w:rPr>
           <w:color w:val="C00000"/>
         </w:rPr>
-        <w:t>Talvez você esteja achando que já sabe qual dos dois irmãos queria sair da dupla. Segure essa conclusão. O que aconteceu com Sandy depois daquela entrevista foi cruel. Só que o motivo que acabou com a dupla vinha de outro lugar, e quase ninguém estava olhando para ele.</w:t>
+        <w:t>Talvez você esteja achando que já sabe qual dos dois irmãos queria sair da dupla. Segure essa conclusão. O que aconteceu com Sandy depois daquela entrevista foi cruel. Só que a decisão que acabou com a dupla nasceu em outro lugar, onde quase ninguém estava olhando.</w:t>
       </w:r>
     </w:p>
     <w:p>
@@ -311,7 +311,7 @@
         <w:rPr>
           <w:color w:val="000000"/>
         </w:rPr>
-        <w:t>Ela namorava, como qualquer garota da idade dela. Só que precisava esconder.</w:t>
+        <w:t>Com o tempo, ela começou a namorar, como qualquer garota da idade dela. Só que precisava esconder.</w:t>
       </w:r>
     </w:p>
     <w:p>
@@ -367,7 +367,7 @@
         <w:rPr>
           <w:color w:val="000000"/>
         </w:rPr>
-        <w:t>Os irmãos faziam eles mesmos, numa escola cheia de amigos, com música em todos os episódios. As primeiras temporadas foram gravadas numa escola de verdade, em Campinas.</w:t>
+        <w:t>Os irmãos interpretavam a si mesmos, numa escola cheia de amigos, com música em todos os episódios. As primeiras temporadas foram gravadas numa escola de verdade, em Campinas.</w:t>
       </w:r>
     </w:p>
     <w:p>
@@ -415,7 +415,7 @@
         <w:rPr>
           <w:color w:val="C00000"/>
         </w:rPr>
-        <w:t>Lembre de um número. Catorze. Foi a idade de Sandy diante daquela pergunta. E esse mesmo número voltou à vida dela de um jeito que parecia um prêmio, mas funcionava como uma prisão.</w:t>
+        <w:t>Lembre de um número. Catorze. Foi a idade de Sandy diante daquela pergunta. E esse mesmo número voltou à vida dela pouco tempo depois, desta vez espalhado pelas bancas de revista do país inteiro.</w:t>
       </w:r>
     </w:p>
     <w:p>
@@ -487,7 +487,7 @@
         <w:rPr>
           <w:color w:val="C00000"/>
         </w:rPr>
-        <w:t>E é exatamente aqui que esta história muda de direção. Porque, enquanto o Brasil inteiro olhava para Sandy, havia alguém a poucos metros dela ouvindo, nos corredores e nos bastidores, uma frase que se repetia sem parar. Uma frase que nunca apareceu em nenhuma entrevista. E que, anos depois, ia decidir o destino da dupla.</w:t>
+        <w:t>E é exatamente aqui que esta história muda de direção. Porque, enquanto o Brasil inteiro olhava para Sandy, havia alguém a poucos metros dela ouvindo, nos corredores e nos bastidores, uma frase que se repetia. Uma frase que, durante anos, nunca apareceu em nenhuma entrevista. E que, anos depois, ia decidir o destino da dupla.</w:t>
       </w:r>
     </w:p>
     <w:sectPr>

</xml_diff>